<commit_message>
Added types of Dart classes
</commit_message>
<xml_diff>
--- a/programming_mental_models/p1_programming_mental_models.docx
+++ b/programming_mental_models/p1_programming_mental_models.docx
@@ -225,6 +225,43 @@
           <w:szCs w:val="36"/>
         </w:rPr>
         <w:t>7</w:t>
+      </w:r>
+    </w:p>
+    <w:p>
+      <w:pPr>
+        <w:pStyle w:val="ListParagraph"/>
+        <w:numPr>
+          <w:ilvl w:val="0"/>
+          <w:numId w:val="5"/>
+        </w:numPr>
+        <w:jc w:val="both"/>
+        <w:rPr>
+          <w:sz w:val="36"/>
+          <w:szCs w:val="36"/>
+        </w:rPr>
+      </w:pPr>
+      <w:r>
+        <w:rPr>
+          <w:sz w:val="36"/>
+          <w:szCs w:val="36"/>
+        </w:rPr>
+        <w:t>If condition inversing…………………………………………</w:t>
+      </w:r>
+      <w:proofErr w:type="gramStart"/>
+      <w:r>
+        <w:rPr>
+          <w:sz w:val="36"/>
+          <w:szCs w:val="36"/>
+        </w:rPr>
+        <w:t>…..</w:t>
+      </w:r>
+      <w:proofErr w:type="gramEnd"/>
+      <w:r>
+        <w:rPr>
+          <w:sz w:val="36"/>
+          <w:szCs w:val="36"/>
+        </w:rPr>
+        <w:t>9</w:t>
       </w:r>
     </w:p>
     <w:p>
@@ -3980,10 +4017,478 @@
       <w:pPr>
         <w:jc w:val="both"/>
         <w:rPr>
-          <w:sz w:val="36"/>
-          <w:szCs w:val="36"/>
-        </w:rPr>
-      </w:pPr>
+          <w:b/>
+          <w:bCs/>
+          <w:sz w:val="36"/>
+          <w:szCs w:val="36"/>
+        </w:rPr>
+      </w:pPr>
+      <w:r>
+        <w:rPr>
+          <w:b/>
+          <w:bCs/>
+          <w:sz w:val="36"/>
+          <w:szCs w:val="36"/>
+        </w:rPr>
+        <w:t>IF Condition Inversing:</w:t>
+      </w:r>
+    </w:p>
+    <w:p>
+      <w:pPr>
+        <w:jc w:val="both"/>
+        <w:rPr>
+          <w:sz w:val="36"/>
+          <w:szCs w:val="36"/>
+        </w:rPr>
+      </w:pPr>
+      <w:r>
+        <w:rPr>
+          <w:sz w:val="36"/>
+          <w:szCs w:val="36"/>
+        </w:rPr>
+        <w:lastRenderedPageBreak/>
+        <w:t xml:space="preserve"># Using </w:t>
+      </w:r>
+      <w:r>
+        <w:rPr>
+          <w:b/>
+          <w:bCs/>
+          <w:sz w:val="36"/>
+          <w:szCs w:val="36"/>
+        </w:rPr>
+        <w:t>if</w:t>
+      </w:r>
+      <w:r>
+        <w:rPr>
+          <w:sz w:val="36"/>
+          <w:szCs w:val="36"/>
+        </w:rPr>
+        <w:t xml:space="preserve"> block with the condition normally looks like this:</w:t>
+      </w:r>
+    </w:p>
+    <w:p>
+      <w:pPr>
+        <w:jc w:val="both"/>
+        <w:rPr>
+          <w:b/>
+          <w:bCs/>
+          <w:color w:val="D86DCB" w:themeColor="accent5" w:themeTint="99"/>
+          <w:sz w:val="36"/>
+          <w:szCs w:val="36"/>
+        </w:rPr>
+      </w:pPr>
+      <w:r>
+        <w:rPr>
+          <w:b/>
+          <w:bCs/>
+          <w:color w:val="D86DCB" w:themeColor="accent5" w:themeTint="99"/>
+          <w:sz w:val="36"/>
+          <w:szCs w:val="36"/>
+        </w:rPr>
+        <w:t xml:space="preserve">void </w:t>
+      </w:r>
+      <w:proofErr w:type="spellStart"/>
+      <w:r>
+        <w:rPr>
+          <w:b/>
+          <w:bCs/>
+          <w:color w:val="D86DCB" w:themeColor="accent5" w:themeTint="99"/>
+          <w:sz w:val="36"/>
+          <w:szCs w:val="36"/>
+        </w:rPr>
+        <w:t>onTap</w:t>
+      </w:r>
+      <w:proofErr w:type="spellEnd"/>
+      <w:r>
+        <w:rPr>
+          <w:b/>
+          <w:bCs/>
+          <w:color w:val="D86DCB" w:themeColor="accent5" w:themeTint="99"/>
+          <w:sz w:val="36"/>
+          <w:szCs w:val="36"/>
+        </w:rPr>
+        <w:t xml:space="preserve"> () {</w:t>
+      </w:r>
+    </w:p>
+    <w:p>
+      <w:pPr>
+        <w:jc w:val="both"/>
+        <w:rPr>
+          <w:b/>
+          <w:bCs/>
+          <w:color w:val="D86DCB" w:themeColor="accent5" w:themeTint="99"/>
+          <w:sz w:val="36"/>
+          <w:szCs w:val="36"/>
+        </w:rPr>
+      </w:pPr>
+      <w:r>
+        <w:rPr>
+          <w:b/>
+          <w:bCs/>
+          <w:color w:val="D86DCB" w:themeColor="accent5" w:themeTint="99"/>
+          <w:sz w:val="36"/>
+          <w:szCs w:val="36"/>
+        </w:rPr>
+        <w:t xml:space="preserve">   if (</w:t>
+      </w:r>
+      <w:proofErr w:type="spellStart"/>
+      <w:r>
+        <w:rPr>
+          <w:b/>
+          <w:bCs/>
+          <w:color w:val="D86DCB" w:themeColor="accent5" w:themeTint="99"/>
+          <w:sz w:val="36"/>
+          <w:szCs w:val="36"/>
+        </w:rPr>
+        <w:t>isSuccess</w:t>
+      </w:r>
+      <w:proofErr w:type="spellEnd"/>
+      <w:r>
+        <w:rPr>
+          <w:b/>
+          <w:bCs/>
+          <w:color w:val="D86DCB" w:themeColor="accent5" w:themeTint="99"/>
+          <w:sz w:val="36"/>
+          <w:szCs w:val="36"/>
+        </w:rPr>
+        <w:t>) {</w:t>
+      </w:r>
+    </w:p>
+    <w:p>
+      <w:pPr>
+        <w:jc w:val="both"/>
+        <w:rPr>
+          <w:b/>
+          <w:bCs/>
+          <w:color w:val="D86DCB" w:themeColor="accent5" w:themeTint="99"/>
+          <w:sz w:val="36"/>
+          <w:szCs w:val="36"/>
+        </w:rPr>
+      </w:pPr>
+      <w:r>
+        <w:rPr>
+          <w:b/>
+          <w:bCs/>
+          <w:color w:val="D86DCB" w:themeColor="accent5" w:themeTint="99"/>
+          <w:sz w:val="36"/>
+          <w:szCs w:val="36"/>
+        </w:rPr>
+        <w:t xml:space="preserve">       // do something</w:t>
+      </w:r>
+    </w:p>
+    <w:p>
+      <w:pPr>
+        <w:jc w:val="both"/>
+        <w:rPr>
+          <w:b/>
+          <w:bCs/>
+          <w:color w:val="D86DCB" w:themeColor="accent5" w:themeTint="99"/>
+          <w:sz w:val="36"/>
+          <w:szCs w:val="36"/>
+        </w:rPr>
+      </w:pPr>
+      <w:r>
+        <w:rPr>
+          <w:b/>
+          <w:bCs/>
+          <w:color w:val="D86DCB" w:themeColor="accent5" w:themeTint="99"/>
+          <w:sz w:val="36"/>
+          <w:szCs w:val="36"/>
+        </w:rPr>
+        <w:t xml:space="preserve">   </w:t>
+      </w:r>
+      <w:r>
+        <w:rPr>
+          <w:b/>
+          <w:bCs/>
+          <w:color w:val="D86DCB" w:themeColor="accent5" w:themeTint="99"/>
+          <w:sz w:val="36"/>
+          <w:szCs w:val="36"/>
+        </w:rPr>
+        <w:t>}</w:t>
+      </w:r>
+    </w:p>
+    <w:p>
+      <w:pPr>
+        <w:jc w:val="both"/>
+        <w:rPr>
+          <w:b/>
+          <w:bCs/>
+          <w:color w:val="D86DCB" w:themeColor="accent5" w:themeTint="99"/>
+          <w:sz w:val="36"/>
+          <w:szCs w:val="36"/>
+        </w:rPr>
+      </w:pPr>
+      <w:r>
+        <w:rPr>
+          <w:b/>
+          <w:bCs/>
+          <w:color w:val="D86DCB" w:themeColor="accent5" w:themeTint="99"/>
+          <w:sz w:val="36"/>
+          <w:szCs w:val="36"/>
+        </w:rPr>
+        <w:t>}</w:t>
+      </w:r>
+    </w:p>
+    <w:p>
+      <w:pPr>
+        <w:jc w:val="both"/>
+        <w:rPr>
+          <w:sz w:val="36"/>
+          <w:szCs w:val="36"/>
+        </w:rPr>
+      </w:pPr>
+      <w:r>
+        <w:rPr>
+          <w:sz w:val="36"/>
+          <w:szCs w:val="36"/>
+        </w:rPr>
+        <w:t># But if we use the inverse condition or not (</w:t>
+      </w:r>
+      <w:r>
+        <w:rPr>
+          <w:b/>
+          <w:bCs/>
+          <w:sz w:val="36"/>
+          <w:szCs w:val="36"/>
+        </w:rPr>
+        <w:t>!</w:t>
+      </w:r>
+      <w:r>
+        <w:rPr>
+          <w:sz w:val="36"/>
+          <w:szCs w:val="36"/>
+        </w:rPr>
+        <w:t>) then the code becomes</w:t>
+      </w:r>
+    </w:p>
+    <w:p>
+      <w:pPr>
+        <w:jc w:val="both"/>
+        <w:rPr>
+          <w:b/>
+          <w:bCs/>
+          <w:color w:val="D86DCB" w:themeColor="accent5" w:themeTint="99"/>
+          <w:sz w:val="36"/>
+          <w:szCs w:val="36"/>
+        </w:rPr>
+      </w:pPr>
+      <w:r>
+        <w:rPr>
+          <w:b/>
+          <w:bCs/>
+          <w:color w:val="D86DCB" w:themeColor="accent5" w:themeTint="99"/>
+          <w:sz w:val="36"/>
+          <w:szCs w:val="36"/>
+        </w:rPr>
+        <w:t xml:space="preserve">void </w:t>
+      </w:r>
+      <w:proofErr w:type="spellStart"/>
+      <w:r>
+        <w:rPr>
+          <w:b/>
+          <w:bCs/>
+          <w:color w:val="D86DCB" w:themeColor="accent5" w:themeTint="99"/>
+          <w:sz w:val="36"/>
+          <w:szCs w:val="36"/>
+        </w:rPr>
+        <w:t>onTap</w:t>
+      </w:r>
+      <w:proofErr w:type="spellEnd"/>
+      <w:r>
+        <w:rPr>
+          <w:b/>
+          <w:bCs/>
+          <w:color w:val="D86DCB" w:themeColor="accent5" w:themeTint="99"/>
+          <w:sz w:val="36"/>
+          <w:szCs w:val="36"/>
+        </w:rPr>
+        <w:t xml:space="preserve"> () {</w:t>
+      </w:r>
+    </w:p>
+    <w:p>
+      <w:pPr>
+        <w:jc w:val="both"/>
+        <w:rPr>
+          <w:b/>
+          <w:bCs/>
+          <w:color w:val="D86DCB" w:themeColor="accent5" w:themeTint="99"/>
+          <w:sz w:val="36"/>
+          <w:szCs w:val="36"/>
+        </w:rPr>
+      </w:pPr>
+      <w:r>
+        <w:rPr>
+          <w:b/>
+          <w:bCs/>
+          <w:color w:val="D86DCB" w:themeColor="accent5" w:themeTint="99"/>
+          <w:sz w:val="36"/>
+          <w:szCs w:val="36"/>
+        </w:rPr>
+        <w:t xml:space="preserve">   if </w:t>
+      </w:r>
+      <w:proofErr w:type="gramStart"/>
+      <w:r>
+        <w:rPr>
+          <w:b/>
+          <w:bCs/>
+          <w:color w:val="D86DCB" w:themeColor="accent5" w:themeTint="99"/>
+          <w:sz w:val="36"/>
+          <w:szCs w:val="36"/>
+        </w:rPr>
+        <w:t>(</w:t>
+      </w:r>
+      <w:r>
+        <w:rPr>
+          <w:b/>
+          <w:bCs/>
+          <w:color w:val="D86DCB" w:themeColor="accent5" w:themeTint="99"/>
+          <w:sz w:val="36"/>
+          <w:szCs w:val="36"/>
+        </w:rPr>
+        <w:t>!</w:t>
+      </w:r>
+      <w:proofErr w:type="spellStart"/>
+      <w:r>
+        <w:rPr>
+          <w:b/>
+          <w:bCs/>
+          <w:color w:val="D86DCB" w:themeColor="accent5" w:themeTint="99"/>
+          <w:sz w:val="36"/>
+          <w:szCs w:val="36"/>
+        </w:rPr>
+        <w:t>isSuccess</w:t>
+      </w:r>
+      <w:proofErr w:type="spellEnd"/>
+      <w:proofErr w:type="gramEnd"/>
+      <w:r>
+        <w:rPr>
+          <w:b/>
+          <w:bCs/>
+          <w:color w:val="D86DCB" w:themeColor="accent5" w:themeTint="99"/>
+          <w:sz w:val="36"/>
+          <w:szCs w:val="36"/>
+        </w:rPr>
+        <w:t xml:space="preserve">) </w:t>
+      </w:r>
+      <w:r>
+        <w:rPr>
+          <w:b/>
+          <w:bCs/>
+          <w:color w:val="D86DCB" w:themeColor="accent5" w:themeTint="99"/>
+          <w:sz w:val="36"/>
+          <w:szCs w:val="36"/>
+        </w:rPr>
+        <w:t>return;</w:t>
+      </w:r>
+    </w:p>
+    <w:p>
+      <w:pPr>
+        <w:jc w:val="both"/>
+        <w:rPr>
+          <w:b/>
+          <w:bCs/>
+          <w:color w:val="D86DCB" w:themeColor="accent5" w:themeTint="99"/>
+          <w:sz w:val="36"/>
+          <w:szCs w:val="36"/>
+        </w:rPr>
+      </w:pPr>
+      <w:r>
+        <w:rPr>
+          <w:b/>
+          <w:bCs/>
+          <w:color w:val="D86DCB" w:themeColor="accent5" w:themeTint="99"/>
+          <w:sz w:val="36"/>
+          <w:szCs w:val="36"/>
+        </w:rPr>
+        <w:t xml:space="preserve">   // do something</w:t>
+      </w:r>
+    </w:p>
+    <w:p>
+      <w:pPr>
+        <w:jc w:val="both"/>
+        <w:rPr>
+          <w:b/>
+          <w:bCs/>
+          <w:color w:val="D86DCB" w:themeColor="accent5" w:themeTint="99"/>
+          <w:sz w:val="36"/>
+          <w:szCs w:val="36"/>
+        </w:rPr>
+      </w:pPr>
+      <w:r>
+        <w:rPr>
+          <w:b/>
+          <w:bCs/>
+          <w:color w:val="D86DCB" w:themeColor="accent5" w:themeTint="99"/>
+          <w:sz w:val="36"/>
+          <w:szCs w:val="36"/>
+        </w:rPr>
+        <w:t>}</w:t>
+      </w:r>
+    </w:p>
+    <w:p>
+      <w:pPr>
+        <w:jc w:val="both"/>
+        <w:rPr>
+          <w:sz w:val="36"/>
+          <w:szCs w:val="36"/>
+        </w:rPr>
+      </w:pPr>
+      <w:r>
+        <w:rPr>
+          <w:sz w:val="36"/>
+          <w:szCs w:val="36"/>
+        </w:rPr>
+        <w:t xml:space="preserve"># The code becomes shorter and more readable because </w:t>
+      </w:r>
+      <w:r>
+        <w:rPr>
+          <w:b/>
+          <w:bCs/>
+          <w:sz w:val="36"/>
+          <w:szCs w:val="36"/>
+        </w:rPr>
+        <w:t xml:space="preserve">if </w:t>
+      </w:r>
+      <w:r>
+        <w:rPr>
+          <w:sz w:val="36"/>
+          <w:szCs w:val="36"/>
+        </w:rPr>
+        <w:t>block is now single line.</w:t>
+      </w:r>
+    </w:p>
+    <w:p>
+      <w:pPr>
+        <w:jc w:val="both"/>
+        <w:rPr>
+          <w:sz w:val="36"/>
+          <w:szCs w:val="36"/>
+        </w:rPr>
+      </w:pPr>
+      <w:r>
+        <w:rPr>
+          <w:sz w:val="36"/>
+          <w:szCs w:val="36"/>
+        </w:rPr>
+        <w:t># So, prefer conditions with not (!) when using</w:t>
+      </w:r>
+      <w:r>
+        <w:rPr>
+          <w:b/>
+          <w:bCs/>
+          <w:sz w:val="36"/>
+          <w:szCs w:val="36"/>
+        </w:rPr>
+        <w:t xml:space="preserve"> if</w:t>
+      </w:r>
+      <w:r>
+        <w:rPr>
+          <w:sz w:val="36"/>
+          <w:szCs w:val="36"/>
+        </w:rPr>
+        <w:t xml:space="preserve"> block, if it’s possible</w:t>
+      </w:r>
     </w:p>
     <w:p>
       <w:pPr>

</xml_diff>